<commit_message>
fix(docs): ordre reel du circuit Billing Import/Export dans le cahier, les guides et l'aide
Le controle documentaire est la DERNIERE etape (pieces de sortie BS/BADT ou BEE
puis cloture), apres la facturation et, selon le type de client, le paiement
(Normal), le lettrage IRIS (Deposit) ou rien (En compte). Ecart releve par le MOT.

- Cahier de recette v1.4 (156 cas) : R05, R06 (depot des pieces de sortie et
  cloture ; le rejet de piece n'existe pas), R07, R08, R09, R11 corriges ; client :
  demander la facture, deposer la preuve de paiement ; E2E-01/02 corriges,
  E2E-09 (Deposit) et E2E-10 (En compte) ajoutes
- Guides de test v1.1 : Manifeste, Controle documentaire, Facturation, Caisse,
  Comptabilite, Back Office Export, Client (payer une facture)
- Fiches d'aide : 12 fiches corrigees (FR/EN) ; migration qui ne reecrit une
  fiche en base que si elle contient encore l'ancien texte
</commit_message>
<xml_diff>
--- a/docs/recette/guides-utilisateurs/Guide-de-test-Agent-Back-Office-Export.docx
+++ b/docs/recette/guides-utilisateurs/Guide-de-test-Agent-Back-Office-Export.docx
@@ -57,7 +57,7 @@
           <w:sz w:val="22"/>
           <w:szCs w:val="22"/>
         </w:rPr>
-        <w:t xml:space="preserve">Version 1.0 — 28/09/2026</w:t>
+        <w:t xml:space="preserve">Version 1.1 — 28/09/2026</w:t>
       </w:r>
     </w:p>
     <w:tbl>
@@ -3254,7 +3254,7 @@
                 <w:sz w:val="20"/>
                 <w:szCs w:val="20"/>
               </w:rPr>
-              <w:t xml:space="preserve">Le dossier quitte votre liste et passe à l'étape « Contrôle documentaire Export ».</w:t>
+              <w:t xml:space="preserve">Le dossier quitte votre liste et passe à l'étape « Facturation ».</w:t>
             </w:r>
           </w:p>
         </w:tc>

</xml_diff>